<commit_message>
Fix detailed discussion formatting issues
- Remove page-break-inside:avoid from tables — prevents large tables
  from leaving blank pages (comparison table now flows naturally)
- Convert inline italic sub-labels (*Label:* text) to bold in section 6.7
  to prevent p>em:only-child CSS rule from centering them as captions
- Fix Chapter 7 heading accidentally included as a table row (missing
  blank line after table caused markdown parser to swallow the heading)
- Convert standalone italic disclaimer to plain text Note paragraph

Co-Authored-By: Claude Sonnet 4.6 <noreply@anthropic.com>
</commit_message>
<xml_diff>
--- a/BTP2_REPORT.docx
+++ b/BTP2_REPORT.docx
@@ -7030,8 +7030,8 @@
       </w:pPr>
       <w:r>
         <w:rPr>
-          <w:iCs/>
-          <w:i/>
+          <w:bCs/>
+          <w:b/>
         </w:rPr>
         <w:t xml:space="preserve">Metabolic Engineering:</w:t>
       </w:r>
@@ -7048,8 +7048,8 @@
       </w:pPr>
       <w:r>
         <w:rPr>
-          <w:iCs/>
-          <w:i/>
+          <w:bCs/>
+          <w:b/>
         </w:rPr>
         <w:t xml:space="preserve">Culture Medium Optimization:</w:t>
       </w:r>
@@ -7066,8 +7066,8 @@
       </w:pPr>
       <w:r>
         <w:rPr>
-          <w:iCs/>
-          <w:i/>
+          <w:bCs/>
+          <w:b/>
         </w:rPr>
         <w:t xml:space="preserve">Host-Specific Strategies:</w:t>
       </w:r>
@@ -7084,8 +7084,8 @@
       </w:pPr>
       <w:r>
         <w:rPr>
-          <w:iCs/>
-          <w:i/>
+          <w:bCs/>
+          <w:b/>
         </w:rPr>
         <w:t xml:space="preserve">Key Quantitative Findings:</w:t>
       </w:r>
@@ -8868,68 +8868,16 @@
       </w:pPr>
       <w:r>
         <w:rPr>
-          <w:iCs/>
-          <w:i/>
-        </w:rPr>
-        <w:t xml:space="preserve">Enzyme Overexpression:</w:t>
-      </w:r>
-      <w:r>
-        <w:t xml:space="preserve"> </w:t>
-      </w:r>
-      <w:r>
-        <w:t xml:space="preserve">The graph indicates that overexpressing the all-trans-beta-carotene hydroxylase gene leads to an</w:t>
-      </w:r>
-      <w:r>
-        <w:t xml:space="preserve"> </w:t>
-      </w:r>
-      <w:r>
-        <w:rPr>
           <w:bCs/>
           <w:b/>
         </w:rPr>
-        <w:t xml:space="preserve">11.3-fold</w:t>
-      </w:r>
-      <w:r>
-        <w:t xml:space="preserve"> </w:t>
-      </w:r>
-      <w:r>
-        <w:t xml:space="preserve">increase in beta-carotene. This enzyme converts lycopene to beta-carotene, a rate-limiting step in many pathways.</w:t>
-      </w:r>
-    </w:p>
-    <w:p>
-      <w:pPr>
-        <w:pStyle w:val="BodyText"/>
-      </w:pPr>
-      <w:r>
-        <w:rPr>
-          <w:iCs/>
-          <w:i/>
-        </w:rPr>
-        <w:t xml:space="preserve">Subcellular Targeting:</w:t>
-      </w:r>
-      <w:r>
-        <w:t xml:space="preserve"> </w:t>
-      </w:r>
-      <w:r>
-        <w:t xml:space="preserve">Targeting key enzymes to peroxisomes enhances flux by compartmentalizing intermediates and reducing feedback inhibition.</w:t>
-      </w:r>
-    </w:p>
-    <w:p>
-      <w:pPr>
-        <w:pStyle w:val="BodyText"/>
-      </w:pPr>
-      <w:r>
-        <w:rPr>
-          <w:iCs/>
-          <w:i/>
-        </w:rPr>
-        <w:t xml:space="preserve">Gene Deletion and Optimization:</w:t>
-      </w:r>
-      <w:r>
-        <w:t xml:space="preserve"> </w:t>
-      </w:r>
-      <w:r>
-        <w:t xml:space="preserve">Multi-objective optimisation identified specific gene deletions that redirect metabolic flux toward the carotenoid pathway, yielding a</w:t>
+        <w:t xml:space="preserve">Enzyme Overexpression:</w:t>
+      </w:r>
+      <w:r>
+        <w:t xml:space="preserve"> </w:t>
+      </w:r>
+      <w:r>
+        <w:t xml:space="preserve">The graph indicates that overexpressing the all-trans-beta-carotene hydroxylase gene leads to an</w:t>
       </w:r>
       <w:r>
         <w:t xml:space="preserve"> </w:t>
@@ -8939,13 +8887,13 @@
           <w:bCs/>
           <w:b/>
         </w:rPr>
-        <w:t xml:space="preserve">107.3%</w:t>
-      </w:r>
-      <w:r>
-        <w:t xml:space="preserve"> </w:t>
-      </w:r>
-      <w:r>
-        <w:t xml:space="preserve">increase over the wild-type strain.</w:t>
+        <w:t xml:space="preserve">11.3-fold</w:t>
+      </w:r>
+      <w:r>
+        <w:t xml:space="preserve"> </w:t>
+      </w:r>
+      <w:r>
+        <w:t xml:space="preserve">increase in beta-carotene. This enzyme converts lycopene to beta-carotene, a rate-limiting step in many pathways.</w:t>
       </w:r>
     </w:p>
     <w:p>
@@ -8957,87 +8905,47 @@
           <w:bCs/>
           <w:b/>
         </w:rPr>
-        <w:t xml:space="preserve">3.2 Medium Composition</w:t>
-      </w:r>
-    </w:p>
-    <w:p>
-      <w:pPr>
-        <w:pStyle w:val="BodyText"/>
-      </w:pPr>
-      <w:r>
-        <w:rPr>
-          <w:iCs/>
-          <w:i/>
-        </w:rPr>
-        <w:t xml:space="preserve">Carbon Sources:</w:t>
-      </w:r>
-      <w:r>
-        <w:t xml:space="preserve"> </w:t>
-      </w:r>
-      <w:r>
-        <w:t xml:space="preserve">Inexpensive carbon sources such as glucose and peptone significantly increase production. The graph reports a</w:t>
-      </w:r>
-      <w:r>
-        <w:t xml:space="preserve"> </w:t>
-      </w:r>
+        <w:t xml:space="preserve">Subcellular Targeting:</w:t>
+      </w:r>
+      <w:r>
+        <w:t xml:space="preserve"> </w:t>
+      </w:r>
+      <w:r>
+        <w:t xml:space="preserve">Targeting key enzymes to peroxisomes enhances flux by compartmentalizing intermediates and reducing feedback inhibition.</w:t>
+      </w:r>
+    </w:p>
+    <w:p>
+      <w:pPr>
+        <w:pStyle w:val="BodyText"/>
+      </w:pPr>
       <w:r>
         <w:rPr>
           <w:bCs/>
           <w:b/>
         </w:rPr>
-        <w:t xml:space="preserve">107.22 mg/L</w:t>
-      </w:r>
-      <w:r>
-        <w:t xml:space="preserve"> </w:t>
-      </w:r>
-      <w:r>
-        <w:t xml:space="preserve">yield when glucose is used as the primary carbon source.</w:t>
-      </w:r>
-    </w:p>
-    <w:p>
-      <w:pPr>
-        <w:pStyle w:val="BodyText"/>
-      </w:pPr>
-      <w:r>
-        <w:rPr>
-          <w:iCs/>
-          <w:i/>
-        </w:rPr>
-        <w:t xml:space="preserve">Nitrogen and Peptone:</w:t>
-      </w:r>
-      <w:r>
-        <w:t xml:space="preserve"> </w:t>
-      </w:r>
-      <w:r>
-        <w:t xml:space="preserve">Adjusting nitrogen-source concentration and adding peptone improves biomass and pigment synthesis, contributing to higher specific productivity (</w:t>
+        <w:t xml:space="preserve">Gene Deletion and Optimization:</w:t>
+      </w:r>
+      <w:r>
+        <w:t xml:space="preserve"> </w:t>
+      </w:r>
+      <w:r>
+        <w:t xml:space="preserve">Multi-objective optimisation identified specific gene deletions that redirect metabolic flux toward the carotenoid pathway, yielding a</w:t>
+      </w:r>
+      <w:r>
+        <w:t xml:space="preserve"> </w:t>
       </w:r>
       <w:r>
         <w:rPr>
           <w:bCs/>
           <w:b/>
         </w:rPr>
-        <w:t xml:space="preserve">0.165 g/L/h</w:t>
-      </w:r>
-      <w:r>
-        <w:t xml:space="preserve">).</w:t>
-      </w:r>
-    </w:p>
-    <w:p>
-      <w:pPr>
-        <w:pStyle w:val="BodyText"/>
-      </w:pPr>
-      <w:r>
-        <w:rPr>
-          <w:iCs/>
-          <w:i/>
-        </w:rPr>
-        <w:t xml:space="preserve">pH and Temperature:</w:t>
-      </w:r>
-      <w:r>
-        <w:t xml:space="preserve"> </w:t>
-      </w:r>
-      <w:r>
-        <w:t xml:space="preserve">Optimal pH and temperature (30 degrees C) reduce oxidative stress (78.9% decrease in H2O2) and enhance enzyme activity.</w:t>
+        <w:t xml:space="preserve">107.3%</w:t>
+      </w:r>
+      <w:r>
+        <w:t xml:space="preserve"> </w:t>
+      </w:r>
+      <w:r>
+        <w:t xml:space="preserve">increase over the wild-type strain.</w:t>
       </w:r>
     </w:p>
     <w:p>
@@ -9049,34 +8957,126 @@
           <w:bCs/>
           <w:b/>
         </w:rPr>
-        <w:t xml:space="preserve">3.3 Process Design</w:t>
-      </w:r>
-    </w:p>
-    <w:p>
-      <w:pPr>
-        <w:pStyle w:val="BodyText"/>
-      </w:pPr>
-      <w:r>
-        <w:rPr>
-          <w:iCs/>
-          <w:i/>
-        </w:rPr>
-        <w:t xml:space="preserve">Response Surface Methodology (RSM):</w:t>
-      </w:r>
-      <w:r>
-        <w:t xml:space="preserve"> </w:t>
-      </w:r>
-      <w:r>
-        <w:t xml:space="preserve">RSM was used to fine-tune medium components, achieving</w:t>
-      </w:r>
-      <w:r>
-        <w:t xml:space="preserve"> </w:t>
-      </w:r>
+        <w:t xml:space="preserve">3.2 Medium Composition</w:t>
+      </w:r>
+    </w:p>
+    <w:p>
+      <w:pPr>
+        <w:pStyle w:val="BodyText"/>
+      </w:pPr>
       <w:r>
         <w:rPr>
           <w:bCs/>
           <w:b/>
         </w:rPr>
+        <w:t xml:space="preserve">Carbon Sources:</w:t>
+      </w:r>
+      <w:r>
+        <w:t xml:space="preserve"> </w:t>
+      </w:r>
+      <w:r>
+        <w:t xml:space="preserve">Inexpensive carbon sources such as glucose and peptone significantly increase production. The graph reports a</w:t>
+      </w:r>
+      <w:r>
+        <w:t xml:space="preserve"> </w:t>
+      </w:r>
+      <w:r>
+        <w:rPr>
+          <w:bCs/>
+          <w:b/>
+        </w:rPr>
+        <w:t xml:space="preserve">107.22 mg/L</w:t>
+      </w:r>
+      <w:r>
+        <w:t xml:space="preserve"> </w:t>
+      </w:r>
+      <w:r>
+        <w:t xml:space="preserve">yield when glucose is used as the primary carbon source.</w:t>
+      </w:r>
+    </w:p>
+    <w:p>
+      <w:pPr>
+        <w:pStyle w:val="BodyText"/>
+      </w:pPr>
+      <w:r>
+        <w:rPr>
+          <w:bCs/>
+          <w:b/>
+        </w:rPr>
+        <w:t xml:space="preserve">Nitrogen and Peptone:</w:t>
+      </w:r>
+      <w:r>
+        <w:t xml:space="preserve"> </w:t>
+      </w:r>
+      <w:r>
+        <w:t xml:space="preserve">Adjusting nitrogen-source concentration and adding peptone improves biomass and pigment synthesis, contributing to higher specific productivity (</w:t>
+      </w:r>
+      <w:r>
+        <w:rPr>
+          <w:bCs/>
+          <w:b/>
+        </w:rPr>
+        <w:t xml:space="preserve">0.165 g/L/h</w:t>
+      </w:r>
+      <w:r>
+        <w:t xml:space="preserve">).</w:t>
+      </w:r>
+    </w:p>
+    <w:p>
+      <w:pPr>
+        <w:pStyle w:val="BodyText"/>
+      </w:pPr>
+      <w:r>
+        <w:rPr>
+          <w:bCs/>
+          <w:b/>
+        </w:rPr>
+        <w:t xml:space="preserve">pH and Temperature:</w:t>
+      </w:r>
+      <w:r>
+        <w:t xml:space="preserve"> </w:t>
+      </w:r>
+      <w:r>
+        <w:t xml:space="preserve">Optimal pH and temperature (30 degrees C) reduce oxidative stress (78.9% decrease in H2O2) and enhance enzyme activity.</w:t>
+      </w:r>
+    </w:p>
+    <w:p>
+      <w:pPr>
+        <w:pStyle w:val="BodyText"/>
+      </w:pPr>
+      <w:r>
+        <w:rPr>
+          <w:bCs/>
+          <w:b/>
+        </w:rPr>
+        <w:t xml:space="preserve">3.3 Process Design</w:t>
+      </w:r>
+    </w:p>
+    <w:p>
+      <w:pPr>
+        <w:pStyle w:val="BodyText"/>
+      </w:pPr>
+      <w:r>
+        <w:rPr>
+          <w:bCs/>
+          <w:b/>
+        </w:rPr>
+        <w:t xml:space="preserve">Response Surface Methodology (RSM):</w:t>
+      </w:r>
+      <w:r>
+        <w:t xml:space="preserve"> </w:t>
+      </w:r>
+      <w:r>
+        <w:t xml:space="preserve">RSM was used to fine-tune medium components, achieving</w:t>
+      </w:r>
+      <w:r>
+        <w:t xml:space="preserve"> </w:t>
+      </w:r>
+      <w:r>
+        <w:rPr>
+          <w:bCs/>
+          <w:b/>
+        </w:rPr>
         <w:t xml:space="preserve">11.4 mg/g DCW</w:t>
       </w:r>
       <w:r>
@@ -9089,8 +9089,8 @@
       </w:pPr>
       <w:r>
         <w:rPr>
-          <w:iCs/>
-          <w:i/>
+          <w:bCs/>
+          <w:b/>
         </w:rPr>
         <w:t xml:space="preserve">Hydrogen Peroxide Management:</w:t>
       </w:r>
@@ -9542,11 +9542,7 @@
         <w:pStyle w:val="FirstParagraph"/>
       </w:pPr>
       <w:r>
-        <w:rPr>
-          <w:iCs/>
-          <w:i/>
-        </w:rPr>
-        <w:t xml:space="preserve">The above answer was generated entirely from 50 semantically retrieved triples spanning 23 source papers. No LLM training-data content was used. Every quantitative value (11.3-fold, 107.22 mg/L, 142 mg/L, 78.9%) is traceable to a specific extracted triple and source PMID.</w:t>
+        <w:t xml:space="preserve">Note: The above answer was generated entirely from 50 semantically retrieved triples spanning 23 source papers. No LLM training-data content was used. Every quantitative value (11.3-fold, 107.22 mg/L, 142 mg/L, 78.9%) is traceable to a specific extracted triple and source PMID.</w:t>
       </w:r>
     </w:p>
     <w:p>

</xml_diff>